<commit_message>
docs: build step on a fresh clone, per-account binding, CI wording, Swagger figure
On a fresh clone nothing builds @shelf/shared, so the documented steps failed
(the client, the tests and the UI smoke import its dist). README, the stage 2
report's «Інструкція із запуску» and the project notes now run `pnpm build` right
after `pnpm install`; README asks for Node.js 22.12+ like engines. The report
describes the folder and tracking kept per account, the run when tracking
turns on and a manual sync waiting for an automatic run; it says the GitHub
Actions workflow is configured to run on push and pull request once the
repository is on GitHub; the desktop test counts and log are regenerated (42,
240 in total). A float barrier keeps the Swagger figure inside section 3.
</commit_message>
<xml_diff>
--- a/docs/reports/stage2-desktop.docx
+++ b/docs/reports/stage2-desktop.docx
@@ -1205,7 +1205,19 @@
         <w:rPr>
           <w:lang w:val="uk"/>
         </w:rPr>
-        <w:t xml:space="preserve">зберігає адресу сервера, прив’язану папку і стан перемикача відстеження.</w:t>
+        <w:t xml:space="preserve">зберігає адресу сервера і для кожного облікового запису — прив’язану папку та стан</w:t>
+      </w:r>
+      <w:r>
+        <w:rPr>
+          <w:lang w:val="uk"/>
+        </w:rPr>
+        <w:t xml:space="preserve"> </w:t>
+      </w:r>
+      <w:r>
+        <w:rPr>
+          <w:lang w:val="uk"/>
+        </w:rPr>
+        <w:t xml:space="preserve">перемикача відстеження.</w:t>
       </w:r>
     </w:p>
     <w:tbl>
@@ -9474,19 +9486,43 @@
         <w:rPr>
           <w:lang w:val="uk"/>
         </w:rPr>
-        <w:t xml:space="preserve">«Синхронізувати» і прапорець автоматичного відстеження; шлях зберігається в</w:t>
-      </w:r>
-      <w:r>
-        <w:rPr>
-          <w:lang w:val="uk"/>
-        </w:rPr>
-        <w:t xml:space="preserve"> </w:t>
-      </w:r>
-      <w:r>
-        <w:rPr>
-          <w:lang w:val="uk"/>
-        </w:rPr>
-        <w:t xml:space="preserve">налаштуваннях. «Синхронізувати» запускає в main-процесі</w:t>
+        <w:t xml:space="preserve">«Синхронізувати» і прапорець автоматичного відстеження. Шлях і стан прапорця</w:t>
+      </w:r>
+      <w:r>
+        <w:rPr>
+          <w:lang w:val="uk"/>
+        </w:rPr>
+        <w:t xml:space="preserve"> </w:t>
+      </w:r>
+      <w:r>
+        <w:rPr>
+          <w:lang w:val="uk"/>
+        </w:rPr>
+        <w:t xml:space="preserve">зберігаються окремо для кожного облікового запису (адреса сервера й користувач):</w:t>
+      </w:r>
+      <w:r>
+        <w:rPr>
+          <w:lang w:val="uk"/>
+        </w:rPr>
+        <w:t xml:space="preserve"> </w:t>
+      </w:r>
+      <w:r>
+        <w:rPr>
+          <w:lang w:val="uk"/>
+        </w:rPr>
+        <w:t xml:space="preserve">після виходу відстеження зупиняється, а наступний користувач не успадковує ні</w:t>
+      </w:r>
+      <w:r>
+        <w:rPr>
+          <w:lang w:val="uk"/>
+        </w:rPr>
+        <w:t xml:space="preserve"> </w:t>
+      </w:r>
+      <w:r>
+        <w:rPr>
+          <w:lang w:val="uk"/>
+        </w:rPr>
+        <w:t xml:space="preserve">папки, ні відстеження. «Синхронізувати» запускає в main-процесі</w:t>
       </w:r>
       <w:r>
         <w:rPr>
@@ -10549,6 +10585,55 @@
           <w:rStyle w:val="VerbatimChar"/>
           <w:lang w:val="uk"/>
         </w:rPr>
+        <w:t xml:space="preserve">chokidar</w:t>
+      </w:r>
+      <w:r>
+        <w:rPr>
+          <w:lang w:val="uk"/>
+        </w:rPr>
+        <w:t xml:space="preserve"> </w:t>
+      </w:r>
+      <w:r>
+        <w:rPr>
+          <w:lang w:val="uk"/>
+        </w:rPr>
+        <w:t xml:space="preserve">повідомляє лише про нові зміни, тому одразу</w:t>
+      </w:r>
+      <w:r>
+        <w:rPr>
+          <w:lang w:val="uk"/>
+        </w:rPr>
+        <w:t xml:space="preserve"> </w:t>
+      </w:r>
+      <w:r>
+        <w:rPr>
+          <w:lang w:val="uk"/>
+        </w:rPr>
+        <w:t xml:space="preserve">після ввімкнення прапорця (і після входу з уже ввімкненим) виконується один запуск</w:t>
+      </w:r>
+      <w:r>
+        <w:rPr>
+          <w:lang w:val="uk"/>
+        </w:rPr>
+        <w:t xml:space="preserve"> </w:t>
+      </w:r>
+      <w:r>
+        <w:rPr>
+          <w:lang w:val="uk"/>
+        </w:rPr>
+        <w:t xml:space="preserve">для того, що вже відрізняється. Кожен автоматичний запуск</w:t>
+      </w:r>
+      <w:r>
+        <w:rPr>
+          <w:lang w:val="uk"/>
+        </w:rPr>
+        <w:t xml:space="preserve"> </w:t>
+      </w:r>
+      <w:r>
+        <w:rPr>
+          <w:rStyle w:val="VerbatimChar"/>
+          <w:lang w:val="uk"/>
+        </w:rPr>
         <w:t xml:space="preserve">SyncService</w:t>
       </w:r>
       <w:r>
@@ -10561,7 +10646,7 @@
         <w:rPr>
           <w:lang w:val="uk"/>
         </w:rPr>
-        <w:t xml:space="preserve">одразу виконує</w:t>
+        <w:t xml:space="preserve">виконує</w:t>
       </w:r>
       <w:r>
         <w:rPr>
@@ -10611,6 +10696,30 @@
           <w:lang w:val="uk"/>
         </w:rPr>
         <w:t xml:space="preserve">виконується ще один; поки відкрито діалог конфліктів, автоматичні запуски чекають.</w:t>
+      </w:r>
+      <w:r>
+        <w:rPr>
+          <w:lang w:val="uk"/>
+        </w:rPr>
+        <w:t xml:space="preserve"> </w:t>
+      </w:r>
+      <w:r>
+        <w:rPr>
+          <w:lang w:val="uk"/>
+        </w:rPr>
+        <w:t xml:space="preserve">Натиснуте під час автоматичного запуску «Синхронізувати» дочекається його</w:t>
+      </w:r>
+      <w:r>
+        <w:rPr>
+          <w:lang w:val="uk"/>
+        </w:rPr>
+        <w:t xml:space="preserve"> </w:t>
+      </w:r>
+      <w:r>
+        <w:rPr>
+          <w:lang w:val="uk"/>
+        </w:rPr>
+        <w:t xml:space="preserve">завершення і лише тоді перевірить папку.</w:t>
       </w:r>
       <w:r>
         <w:rPr>
@@ -10784,19 +10893,44 @@
         <w:rPr>
           <w:lang w:val="uk"/>
         </w:rPr>
-        <w:t xml:space="preserve">у корені запускає всі, а</w:t>
-      </w:r>
-      <w:r>
-        <w:rPr>
-          <w:lang w:val="uk"/>
-        </w:rPr>
-        <w:t xml:space="preserve"> </w:t>
-      </w:r>
-      <w:r>
-        <w:rPr>
-          <w:lang w:val="uk"/>
-        </w:rPr>
-        <w:t xml:space="preserve">GitHub Actions — після кожного</w:t>
+        <w:t xml:space="preserve">у корені запускає всі.</w:t>
+      </w:r>
+      <w:r>
+        <w:rPr>
+          <w:lang w:val="uk"/>
+        </w:rPr>
+        <w:t xml:space="preserve"> </w:t>
+      </w:r>
+      <w:r>
+        <w:rPr>
+          <w:lang w:val="uk"/>
+        </w:rPr>
+        <w:t xml:space="preserve">Робочий процес GitHub Actions (</w:t>
+      </w:r>
+      <w:r>
+        <w:rPr>
+          <w:rStyle w:val="VerbatimChar"/>
+          <w:lang w:val="uk"/>
+        </w:rPr>
+        <w:t xml:space="preserve">.github/workflows/ci.yml</w:t>
+      </w:r>
+      <w:r>
+        <w:rPr>
+          <w:lang w:val="uk"/>
+        </w:rPr>
+        <w:t xml:space="preserve">) налаштовано запускати</w:t>
+      </w:r>
+      <w:r>
+        <w:rPr>
+          <w:lang w:val="uk"/>
+        </w:rPr>
+        <w:t xml:space="preserve"> </w:t>
+      </w:r>
+      <w:r>
+        <w:rPr>
+          <w:lang w:val="uk"/>
+        </w:rPr>
+        <w:t xml:space="preserve">збірку й тести на кожен</w:t>
       </w:r>
       <w:r>
         <w:rPr>
@@ -10815,7 +10949,25 @@
         <w:rPr>
           <w:lang w:val="uk"/>
         </w:rPr>
-        <w:t xml:space="preserve">. Кількість тестів узято з журналів запуску; разом їх 226.</w:t>
+        <w:t xml:space="preserve"> </w:t>
+      </w:r>
+      <w:r>
+        <w:rPr>
+          <w:lang w:val="uk"/>
+        </w:rPr>
+        <w:t xml:space="preserve">і pull request, щойно репозиторій з’явиться на</w:t>
+      </w:r>
+      <w:r>
+        <w:rPr>
+          <w:lang w:val="uk"/>
+        </w:rPr>
+        <w:t xml:space="preserve"> </w:t>
+      </w:r>
+      <w:r>
+        <w:rPr>
+          <w:lang w:val="uk"/>
+        </w:rPr>
+        <w:t xml:space="preserve">GitHub. Кількість тестів узято з журналів запуску; разом їх 240.</w:t>
       </w:r>
     </w:p>
     <w:tbl>
@@ -11265,7 +11417,7 @@
               <w:rPr>
                 <w:lang w:val="uk"/>
               </w:rPr>
-              <w:t xml:space="preserve">(Vitest, 6 файлів)</w:t>
+              <w:t xml:space="preserve">(Vitest, 7 файлів)</w:t>
             </w:r>
           </w:p>
         </w:tc>
@@ -11287,6 +11439,56 @@
               <w:rPr>
                 <w:lang w:val="uk"/>
               </w:rPr>
+              <w:t xml:space="preserve"> </w:t>
+            </w:r>
+            <w:r>
+              <w:rPr>
+                <w:lang w:val="uk"/>
+              </w:rPr>
+              <w:t xml:space="preserve">(папка й відстеження окремо для кожного облікового запису),</w:t>
+            </w:r>
+            <w:r>
+              <w:rPr>
+                <w:lang w:val="uk"/>
+              </w:rPr>
+              <w:t xml:space="preserve"> </w:t>
+            </w:r>
+            <w:r>
+              <w:rPr>
+                <w:rStyle w:val="VerbatimChar"/>
+                <w:lang w:val="uk"/>
+              </w:rPr>
+              <w:t xml:space="preserve">NodeLocalFolder</w:t>
+            </w:r>
+            <w:r>
+              <w:rPr>
+                <w:lang w:val="uk"/>
+              </w:rPr>
+              <w:t xml:space="preserve"> </w:t>
+            </w:r>
+            <w:r>
+              <w:rPr>
+                <w:lang w:val="uk"/>
+              </w:rPr>
+              <w:t xml:space="preserve">і українські повідомлення про помилки файлової системи,</w:t>
+            </w:r>
+            <w:r>
+              <w:rPr>
+                <w:lang w:val="uk"/>
+              </w:rPr>
+              <w:t xml:space="preserve"> </w:t>
+            </w:r>
+            <w:r>
+              <w:rPr>
+                <w:rStyle w:val="VerbatimChar"/>
+                <w:lang w:val="uk"/>
+              </w:rPr>
+              <w:t xml:space="preserve">JsonSnapshotStore</w:t>
+            </w:r>
+            <w:r>
+              <w:rPr>
+                <w:lang w:val="uk"/>
+              </w:rPr>
               <w:t xml:space="preserve">,</w:t>
             </w:r>
             <w:r>
@@ -11300,7 +11502,7 @@
                 <w:rStyle w:val="VerbatimChar"/>
                 <w:lang w:val="uk"/>
               </w:rPr>
-              <w:t xml:space="preserve">NodeLocalFolder</w:t>
+              <w:t xml:space="preserve">FolderWatcher</w:t>
             </w:r>
             <w:r>
               <w:rPr>
@@ -11319,13 +11521,13 @@
                 <w:rStyle w:val="VerbatimChar"/>
                 <w:lang w:val="uk"/>
               </w:rPr>
-              <w:t xml:space="preserve">JsonSnapshotStore</w:t>
-            </w:r>
-            <w:r>
-              <w:rPr>
-                <w:lang w:val="uk"/>
-              </w:rPr>
-              <w:t xml:space="preserve">,</w:t>
+              <w:t xml:space="preserve">SyncService</w:t>
+            </w:r>
+            <w:r>
+              <w:rPr>
+                <w:lang w:val="uk"/>
+              </w:rPr>
+              <w:t xml:space="preserve">;</w:t>
             </w:r>
             <w:r>
               <w:rPr>
@@ -11338,13 +11540,7 @@
                 <w:rStyle w:val="VerbatimChar"/>
                 <w:lang w:val="uk"/>
               </w:rPr>
-              <w:t xml:space="preserve">FolderWatcher</w:t>
-            </w:r>
-            <w:r>
-              <w:rPr>
-                <w:lang w:val="uk"/>
-              </w:rPr>
-              <w:t xml:space="preserve">,</w:t>
+              <w:t xml:space="preserve">SyncEngine</w:t>
             </w:r>
             <w:r>
               <w:rPr>
@@ -11354,38 +11550,6 @@
             </w:r>
             <w:r>
               <w:rPr>
-                <w:rStyle w:val="VerbatimChar"/>
-                <w:lang w:val="uk"/>
-              </w:rPr>
-              <w:t xml:space="preserve">SyncService</w:t>
-            </w:r>
-            <w:r>
-              <w:rPr>
-                <w:lang w:val="uk"/>
-              </w:rPr>
-              <w:t xml:space="preserve">;</w:t>
-            </w:r>
-            <w:r>
-              <w:rPr>
-                <w:lang w:val="uk"/>
-              </w:rPr>
-              <w:t xml:space="preserve"> </w:t>
-            </w:r>
-            <w:r>
-              <w:rPr>
-                <w:rStyle w:val="VerbatimChar"/>
-                <w:lang w:val="uk"/>
-              </w:rPr>
-              <w:t xml:space="preserve">SyncEngine</w:t>
-            </w:r>
-            <w:r>
-              <w:rPr>
-                <w:lang w:val="uk"/>
-              </w:rPr>
-              <w:t xml:space="preserve"> </w:t>
-            </w:r>
-            <w:r>
-              <w:rPr>
                 <w:lang w:val="uk"/>
               </w:rPr>
               <w:t xml:space="preserve">на справжній файловій системі з API в пам’яті</w:t>
@@ -11403,7 +11567,7 @@
               <w:rPr>
                 <w:lang w:val="uk"/>
               </w:rPr>
-              <w:t xml:space="preserve">28</w:t>
+              <w:t xml:space="preserve">42</w:t>
             </w:r>
           </w:p>
         </w:tc>
@@ -13712,7 +13876,7 @@
           <w:rStyle w:val="VerbatimChar"/>
           <w:lang w:val="uk"/>
         </w:rPr>
-        <w:t xml:space="preserve"> Test Files  6 passed (6)</w:t>
+        <w:t xml:space="preserve"> Test Files  7 passed (7)</w:t>
       </w:r>
       <w:r>
         <w:br/>
@@ -13722,7 +13886,7 @@
           <w:rStyle w:val="VerbatimChar"/>
           <w:lang w:val="uk"/>
         </w:rPr>
-        <w:t xml:space="preserve">      Tests  28 passed (28)</w:t>
+        <w:t xml:space="preserve">      Tests  42 passed (42)</w:t>
       </w:r>
     </w:p>
     <w:p>
@@ -13733,7 +13897,7 @@
         <w:rPr>
           <w:lang w:val="uk"/>
         </w:rPr>
-        <w:t xml:space="preserve">Усі 226 тестів проходять; наскрізні перевірки на живому стеку виконують</w:t>
+        <w:t xml:space="preserve">Усі 240 тестів проходять; наскрізні перевірки на живому стеку виконують</w:t>
       </w:r>
       <w:r>
         <w:rPr>
@@ -13855,6 +14019,27 @@
       </w:r>
       <w:r>
         <w:rPr>
+          <w:rStyle w:val="ExtensionTok"/>
+        </w:rPr>
+        <w:t xml:space="preserve">pnpm</w:t>
+      </w:r>
+      <w:r>
+        <w:rPr>
+          <w:rStyle w:val="NormalTok"/>
+        </w:rPr>
+        <w:t xml:space="preserve"> build                        </w:t>
+      </w:r>
+      <w:r>
+        <w:rPr>
+          <w:rStyle w:val="CommentTok"/>
+        </w:rPr>
+        <w:t xml:space="preserve"># збирає пакети, серед них @shelf/shared</w:t>
+      </w:r>
+      <w:r>
+        <w:br/>
+      </w:r>
+      <w:r>
+        <w:rPr>
           <w:rStyle w:val="FunctionTok"/>
         </w:rPr>
         <w:t xml:space="preserve">cp</w:t>
@@ -14375,7 +14560,7 @@
         <w:rPr>
           <w:lang w:val="uk"/>
         </w:rPr>
-        <w:t xml:space="preserve">сховища знімка. Код перевіряють 226 unit-тестів, серед них обов’язкові тести операцій варіанта. Обмеження: видалення під час</w:t>
+        <w:t xml:space="preserve">сховища знімка. Код перевіряють 240 unit-тестів, серед них обов’язкові тести операцій варіанта. Обмеження: видалення під час</w:t>
       </w:r>
       <w:r>
         <w:rPr>

</xml_diff>

<commit_message>
docs: stage 4 report review fixes; current macOS first-launch instructions
</commit_message>
<xml_diff>
--- a/docs/reports/stage2-desktop.docx
+++ b/docs/reports/stage2-desktop.docx
@@ -14254,19 +14254,31 @@
         <w:rPr>
           <w:lang w:val="uk"/>
         </w:rPr>
-        <w:t xml:space="preserve">сертифікатом Apple, тому першого разу Shelf відкривають через контекстне меню</w:t>
-      </w:r>
-      <w:r>
-        <w:rPr>
-          <w:lang w:val="uk"/>
-        </w:rPr>
-        <w:t xml:space="preserve"> </w:t>
-      </w:r>
-      <w:r>
-        <w:rPr>
-          <w:lang w:val="uk"/>
-        </w:rPr>
-        <w:t xml:space="preserve">значка в теці «Програми» і пункт «Відкрити». Демо-користувачів створює</w:t>
+        <w:t xml:space="preserve">сертифікатом Apple. Зібраний на тому самому комп’ютері застосунок відкривається</w:t>
+      </w:r>
+      <w:r>
+        <w:rPr>
+          <w:lang w:val="uk"/>
+        </w:rPr>
+        <w:t xml:space="preserve"> </w:t>
+      </w:r>
+      <w:r>
+        <w:rPr>
+          <w:lang w:val="uk"/>
+        </w:rPr>
+        <w:t xml:space="preserve">одразу, а скачаний з інтернету macOS спочатку блокує, і перший запуск треба</w:t>
+      </w:r>
+      <w:r>
+        <w:rPr>
+          <w:lang w:val="uk"/>
+        </w:rPr>
+        <w:t xml:space="preserve"> </w:t>
+      </w:r>
+      <w:r>
+        <w:rPr>
+          <w:lang w:val="uk"/>
+        </w:rPr>
+        <w:t xml:space="preserve">дозволити в «Системні параметри → Конфіденційність і безпека → Усе одно відкрити». Демо-користувачів створює</w:t>
       </w:r>
       <w:r>
         <w:rPr>

</xml_diff>